<commit_message>
Updates pre - slowness changes
</commit_message>
<xml_diff>
--- a/resources/TIER_NEXT_ITERATION.docx
+++ b/resources/TIER_NEXT_ITERATION.docx
@@ -153,7 +153,7 @@
                 <w:sz w:val="19"/>
                 <w:szCs w:val="19"/>
               </w:rPr>
-              <w:t>R1–R5</w:t>
+              <w:t>R1–R8</w:t>
             </w:r>
           </w:p>
         </w:tc>
@@ -175,7 +175,7 @@
                 <w:sz w:val="19"/>
                 <w:szCs w:val="19"/>
               </w:rPr>
-              <w:t>Validation questionnaire (Excel, n=5)</w:t>
+              <w:t>Validation questionnaire (Excel, n=8)</w:t>
             </w:r>
           </w:p>
         </w:tc>
@@ -197,7 +197,7 @@
                 <w:sz w:val="19"/>
                 <w:szCs w:val="19"/>
               </w:rPr>
-              <w:t>Malawi NGO (R1), Mozambique MoH (R2), South Africa DSD consultant (R3), Zimbabwe community org (R4), Mozambique MoH (R5)</w:t>
+              <w:t>Malawi NGO (R1), Mozambique MoH (R2), South Africa DSD consultant (R3), Zimbabwe community org (R4), Mozambique MoH (R5), Zimbabwe NGO (R6), Kenya NGO (R7), South Africa implementing partner (R8)</w:t>
             </w:r>
           </w:p>
         </w:tc>
@@ -513,6 +513,51 @@
     </w:p>
     <w:p>
       <w:pPr>
+        <w:spacing w:after="180" w:line="276" w:lineRule="auto"/>
+      </w:pPr>
+      <w:r>
+        <w:rPr>
+          <w:i/>
+          <w:iCs/>
+          <w:color w:val="555555"/>
+          <w:sz w:val="21"/>
+          <w:szCs w:val="21"/>
+        </w:rPr>
+        <w:t xml:space="preserve">Round 2 update: the questionnaire sample is now n=8, adding R6 (Zimbabwe, NGO), R7 (Kenya, NGO) and R8 (South Africa, implementing partner). R1–R5 responses are unchanged from the previous round. Mean overall satisfaction is 8.1/10 (range 6–10) and mean likelihood of recommending is 8.9/10 (range 6–10). These remain descriptive of eight self-selected pilot users only and are not generalisable.</w:t>
+      </w:r>
+    </w:p>
+    <w:p>
+      <w:pPr>
+        <w:spacing w:after="180" w:line="276" w:lineRule="auto"/>
+      </w:pPr>
+      <w:r>
+        <w:rPr>
+          <w:i/>
+          <w:iCs/>
+          <w:color w:val="555555"/>
+          <w:sz w:val="21"/>
+          <w:szCs w:val="21"/>
+        </w:rPr>
+        <w:t xml:space="preserve">Two rating patterns are worth carrying into prioritisation. First, “The evidence presented was credible” is the only item in the whole questionnaire that no respondent rated “Strongly agree” (6 Agree, 2 Neutral, n=8) — a consistent ceiling rather than a single dissenter. Second, “TIER-Plus helped identify priorities that might otherwise have been overlooked” remains the lowest-scoring item (mean 3.43, n=7) and is the only item to attract a “Disagree”. Both speak to the tool’s core claim rather than to peripheral features.</w:t>
+      </w:r>
+    </w:p>
+    <w:p>
+      <w:pPr>
+        <w:spacing w:after="180" w:line="276" w:lineRule="auto"/>
+      </w:pPr>
+      <w:r>
+        <w:rPr>
+          <w:i/>
+          <w:iCs/>
+          <w:color w:val="555555"/>
+          <w:sz w:val="21"/>
+          <w:szCs w:val="21"/>
+        </w:rPr>
+        <w:t xml:space="preserve">Two caveats on the new responses. R7 (Kenya) records the lowest satisfaction in the sample (6/10) but attributes this to needing more practice with the tool rather than to any specific defect, and reported no missing interventions or implausible results — better read as an onboarding signal than a verdict on the model. R8 (South Africa) selected “Not applicable or unsure” on all four local-relevance items because they were explicitly not representing a country, so those are structural non-responses, not dissatisfaction.</w:t>
+      </w:r>
+    </w:p>
+    <w:p>
+      <w:pPr>
         <w:pStyle w:val="Heading1"/>
         <w:spacing w:before="320" w:after="140"/>
       </w:pPr>
@@ -727,7 +772,7 @@
                 <w:sz w:val="18"/>
                 <w:szCs w:val="18"/>
               </w:rPr>
-              <w:t xml:space="preserve">  [R3, GDoc, Jeff — Logic]</w:t>
+              <w:t xml:space="preserve">  [R3, GDoc, Jeff, R8 — Logic]</w:t>
             </w:r>
           </w:p>
           <w:p>
@@ -796,7 +841,7 @@
                 <w:sz w:val="18"/>
                 <w:szCs w:val="18"/>
               </w:rPr>
-              <w:t xml:space="preserve">  [R5, Jeff, GDoc — Docs/UI]</w:t>
+              <w:t xml:space="preserve">  [R5, Jeff, GDoc, R8 — Docs/UI]</w:t>
             </w:r>
           </w:p>
           <w:p>
@@ -833,7 +878,7 @@
                 <w:ilvl w:val="0"/>
                 <w:numId w:val="3"/>
               </w:numPr>
-              <w:spacing w:after="20" w:line="268" w:lineRule="auto"/>
+              <w:spacing w:after="90" w:line="268" w:lineRule="auto"/>
             </w:pPr>
             <w:r>
               <w:rPr>
@@ -853,6 +898,60 @@
               <w:t xml:space="preserve">  [GDoc, GDoc2 — UI]</w:t>
             </w:r>
           </w:p>
+          <w:p>
+            <w:pPr>
+              <w:pStyle w:val="ListParagraph"/>
+              <w:numPr>
+                <w:ilvl w:val="0"/>
+                <w:numId w:val="3"/>
+              </w:numPr>
+              <w:spacing w:after="90" w:line="268" w:lineRule="auto"/>
+            </w:pPr>
+            <w:r>
+              <w:rPr>
+                <w:sz w:val="21"/>
+                <w:szCs w:val="21"/>
+              </w:rPr>
+              <w:t xml:space="preserve">Repeat maternal HIV testing in late pregnancy / at delivery is not captured, and is being scaled up in some countries</w:t>
+            </w:r>
+            <w:r>
+              <w:rPr>
+                <w:b/>
+                <w:bCs/>
+                <w:color w:val="2E5395"/>
+                <w:sz w:val="18"/>
+                <w:szCs w:val="18"/>
+              </w:rPr>
+              <w:t xml:space="preserve">  [R3, R8 — Logic]</w:t>
+            </w:r>
+          </w:p>
+          <w:p>
+            <w:pPr>
+              <w:pStyle w:val="ListParagraph"/>
+              <w:numPr>
+                <w:ilvl w:val="0"/>
+                <w:numId w:val="3"/>
+              </w:numPr>
+              <w:spacing w:after="20" w:line="268" w:lineRule="auto"/>
+            </w:pPr>
+            <w:r>
+              <w:rPr>
+                <w:sz w:val="21"/>
+                <w:szCs w:val="21"/>
+              </w:rPr>
+              <w:t xml:space="preserve">Community-led delivery and structural/rights barriers are not represented at all (see §16)</w:t>
+            </w:r>
+            <w:r>
+              <w:rPr>
+                <w:b/>
+                <w:bCs/>
+                <w:color w:val="2E5395"/>
+                <w:sz w:val="18"/>
+                <w:szCs w:val="18"/>
+              </w:rPr>
+              <w:t xml:space="preserve">  [R6, R7 — Logic + UI]</w:t>
+            </w:r>
+          </w:p>
         </w:tc>
       </w:tr>
     </w:tbl>
@@ -1094,6 +1193,33 @@
     </w:p>
     <w:p>
       <w:pPr>
+        <w:pStyle w:val="ListParagraph"/>
+        <w:numPr>
+          <w:ilvl w:val="0"/>
+          <w:numId w:val="3"/>
+        </w:numPr>
+        <w:spacing w:after="90" w:line="268" w:lineRule="auto"/>
+      </w:pPr>
+      <w:r>
+        <w:rPr>
+          <w:sz w:val="21"/>
+          <w:szCs w:val="21"/>
+        </w:rPr>
+        <w:t xml:space="preserve">Make clear that users focusing on one programme area (e.g. treatment vs prevention) may leave other sections at their existing values; the current layout implies every field must be completed, which R8 expects to confuse departmental users.</w:t>
+      </w:r>
+      <w:r>
+        <w:rPr>
+          <w:b/>
+          <w:bCs/>
+          <w:color w:val="2E5395"/>
+          <w:sz w:val="18"/>
+          <w:szCs w:val="18"/>
+        </w:rPr>
+        <w:t xml:space="preserve">  [R8 — UI]</w:t>
+      </w:r>
+    </w:p>
+    <w:p>
+      <w:pPr>
         <w:pStyle w:val="Heading1"/>
         <w:spacing w:before="320" w:after="140"/>
       </w:pPr>
@@ -1637,6 +1763,33 @@
     </w:p>
     <w:p>
       <w:pPr>
+        <w:pStyle w:val="ListParagraph"/>
+        <w:numPr>
+          <w:ilvl w:val="0"/>
+          <w:numId w:val="3"/>
+        </w:numPr>
+        <w:spacing w:after="90" w:line="268" w:lineRule="auto"/>
+      </w:pPr>
+      <w:r>
+        <w:rPr>
+          <w:sz w:val="21"/>
+          <w:szCs w:val="21"/>
+        </w:rPr>
+        <w:t xml:space="preserve">PrEP continuity/continuation is not captured. R8 notes this would affect both incidence and the choice of long-acting method, while acknowledging continuation data can be scarce — independently converging with R3’s continuation-parameter point above.</w:t>
+      </w:r>
+      <w:r>
+        <w:rPr>
+          <w:b/>
+          <w:bCs/>
+          <w:color w:val="2E5395"/>
+          <w:sz w:val="18"/>
+          <w:szCs w:val="18"/>
+        </w:rPr>
+        <w:t xml:space="preserve">  [R8 — Logic]</w:t>
+      </w:r>
+    </w:p>
+    <w:p>
+      <w:pPr>
         <w:pStyle w:val="Heading1"/>
         <w:spacing w:before="320" w:after="140"/>
       </w:pPr>
@@ -2022,6 +2175,60 @@
     </w:p>
     <w:p>
       <w:pPr>
+        <w:pStyle w:val="ListParagraph"/>
+        <w:numPr>
+          <w:ilvl w:val="0"/>
+          <w:numId w:val="3"/>
+        </w:numPr>
+        <w:spacing w:after="90" w:line="268" w:lineRule="auto"/>
+      </w:pPr>
+      <w:r>
+        <w:rPr>
+          <w:sz w:val="21"/>
+          <w:szCs w:val="21"/>
+        </w:rPr>
+        <w:t xml:space="preserve">HTS does not capture maternal retesting before delivery, which some countries are scaling up — independently confirming R3’s repeat late-pregnancy/delivery testing point above.</w:t>
+      </w:r>
+      <w:r>
+        <w:rPr>
+          <w:b/>
+          <w:bCs/>
+          <w:color w:val="2E5395"/>
+          <w:sz w:val="18"/>
+          <w:szCs w:val="18"/>
+        </w:rPr>
+        <w:t xml:space="preserve">  [R8, R3 — Logic]</w:t>
+      </w:r>
+    </w:p>
+    <w:p>
+      <w:pPr>
+        <w:pStyle w:val="ListParagraph"/>
+        <w:numPr>
+          <w:ilvl w:val="0"/>
+          <w:numId w:val="3"/>
+        </w:numPr>
+        <w:spacing w:after="90" w:line="268" w:lineRule="auto"/>
+      </w:pPr>
+      <w:r>
+        <w:rPr>
+          <w:sz w:val="21"/>
+          <w:szCs w:val="21"/>
+        </w:rPr>
+        <w:t xml:space="preserve">Epidemic parameters include no vertical transmission (VTP) metrics.</w:t>
+      </w:r>
+      <w:r>
+        <w:rPr>
+          <w:b/>
+          <w:bCs/>
+          <w:color w:val="2E5395"/>
+          <w:sz w:val="18"/>
+          <w:szCs w:val="18"/>
+        </w:rPr>
+        <w:t xml:space="preserve">  [R8 — Logic]</w:t>
+      </w:r>
+    </w:p>
+    <w:p>
+      <w:pPr>
         <w:pStyle w:val="Heading1"/>
         <w:spacing w:before="320" w:after="140"/>
       </w:pPr>
@@ -2311,6 +2518,60 @@
     </w:p>
     <w:p>
       <w:pPr>
+        <w:pStyle w:val="ListParagraph"/>
+        <w:numPr>
+          <w:ilvl w:val="0"/>
+          <w:numId w:val="3"/>
+        </w:numPr>
+        <w:spacing w:after="90" w:line="268" w:lineRule="auto"/>
+      </w:pPr>
+      <w:r>
+        <w:rPr>
+          <w:sz w:val="21"/>
+          <w:szCs w:val="21"/>
+        </w:rPr>
+        <w:t xml:space="preserve">Add TB outcomes (e.g. TPT); currently absent. Note R3 separately proposes “% TPT initiated” as an AHD proxy in §6 — worth reconciling the two asks into one indicator.</w:t>
+      </w:r>
+      <w:r>
+        <w:rPr>
+          <w:b/>
+          <w:bCs/>
+          <w:color w:val="2E5395"/>
+          <w:sz w:val="18"/>
+          <w:szCs w:val="18"/>
+        </w:rPr>
+        <w:t xml:space="preserve">  [R8 — Logic + UI]</w:t>
+      </w:r>
+    </w:p>
+    <w:p>
+      <w:pPr>
+        <w:pStyle w:val="ListParagraph"/>
+        <w:numPr>
+          <w:ilvl w:val="0"/>
+          <w:numId w:val="3"/>
+        </w:numPr>
+        <w:spacing w:after="90" w:line="268" w:lineRule="auto"/>
+      </w:pPr>
+      <w:r>
+        <w:rPr>
+          <w:sz w:val="21"/>
+          <w:szCs w:val="21"/>
+        </w:rPr>
+        <w:t xml:space="preserve">Community-led prevention service-delivery interventions (drop-in centres, outreach, referrals, prevention literacy and risk communication) are absent — see §16.</w:t>
+      </w:r>
+      <w:r>
+        <w:rPr>
+          <w:b/>
+          <w:bCs/>
+          <w:color w:val="2E5395"/>
+          <w:sz w:val="18"/>
+          <w:szCs w:val="18"/>
+        </w:rPr>
+        <w:t xml:space="preserve">  [R6 — Logic + UI]</w:t>
+      </w:r>
+    </w:p>
+    <w:p>
+      <w:pPr>
         <w:pStyle w:val="Heading1"/>
         <w:spacing w:before="320" w:after="140"/>
       </w:pPr>
@@ -2342,7 +2603,7 @@
           <w:sz w:val="18"/>
           <w:szCs w:val="18"/>
         </w:rPr>
-        <w:t xml:space="preserve">  [R5, Jeff — Docs/UI]</w:t>
+        <w:t xml:space="preserve">  [R5, Jeff, R8 — Docs/UI]</w:t>
       </w:r>
     </w:p>
     <w:p>
@@ -2397,6 +2658,33 @@
           <w:szCs w:val="18"/>
         </w:rPr>
         <w:t xml:space="preserve">  [Jeff — Docs]</w:t>
+      </w:r>
+    </w:p>
+    <w:p>
+      <w:pPr>
+        <w:pStyle w:val="ListParagraph"/>
+        <w:numPr>
+          <w:ilvl w:val="0"/>
+          <w:numId w:val="3"/>
+        </w:numPr>
+        <w:spacing w:after="90" w:line="268" w:lineRule="auto"/>
+      </w:pPr>
+      <w:r>
+        <w:rPr>
+          <w:sz w:val="21"/>
+          <w:szCs w:val="21"/>
+        </w:rPr>
+        <w:t xml:space="preserve">Make the underlying assumptions — especially costing data — visible somewhere in the tool. R8 expected this and names it their single most important pre-rollout improvement, on the grounds that stakeholders will trust outputs they can interrogate.</w:t>
+      </w:r>
+      <w:r>
+        <w:rPr>
+          <w:b/>
+          <w:bCs/>
+          <w:color w:val="2E5395"/>
+          <w:sz w:val="18"/>
+          <w:szCs w:val="18"/>
+        </w:rPr>
+        <w:t xml:space="preserve">  [R8 — Docs/UI]</w:t>
       </w:r>
     </w:p>
     <w:p>
@@ -2504,6 +2792,60 @@
     </w:p>
     <w:p>
       <w:pPr>
+        <w:pStyle w:val="ListParagraph"/>
+        <w:numPr>
+          <w:ilvl w:val="0"/>
+          <w:numId w:val="3"/>
+        </w:numPr>
+        <w:spacing w:after="90" w:line="268" w:lineRule="auto"/>
+      </w:pPr>
+      <w:r>
+        <w:rPr>
+          <w:sz w:val="21"/>
+          <w:szCs w:val="21"/>
+        </w:rPr>
+        <w:t xml:space="preserve">Expose the costing assumptions and unit-cost data behind results (see §8).</w:t>
+      </w:r>
+      <w:r>
+        <w:rPr>
+          <w:b/>
+          <w:bCs/>
+          <w:color w:val="2E5395"/>
+          <w:sz w:val="18"/>
+          <w:szCs w:val="18"/>
+        </w:rPr>
+        <w:t xml:space="preserve">  [R8 — Docs/UI]</w:t>
+      </w:r>
+    </w:p>
+    <w:p>
+      <w:pPr>
+        <w:pStyle w:val="ListParagraph"/>
+        <w:numPr>
+          <w:ilvl w:val="0"/>
+          <w:numId w:val="3"/>
+        </w:numPr>
+        <w:spacing w:after="90" w:line="268" w:lineRule="auto"/>
+      </w:pPr>
+      <w:r>
+        <w:rPr>
+          <w:sz w:val="21"/>
+          <w:szCs w:val="21"/>
+        </w:rPr>
+        <w:t xml:space="preserve">Estimating the community investment required to reach targets is not currently possible (see §16).</w:t>
+      </w:r>
+      <w:r>
+        <w:rPr>
+          <w:b/>
+          <w:bCs/>
+          <w:color w:val="2E5395"/>
+          <w:sz w:val="18"/>
+          <w:szCs w:val="18"/>
+        </w:rPr>
+        <w:t xml:space="preserve">  [R6 — Logic]</w:t>
+      </w:r>
+    </w:p>
+    <w:p>
+      <w:pPr>
         <w:pStyle w:val="Heading1"/>
         <w:spacing w:before="320" w:after="140"/>
       </w:pPr>
@@ -2608,6 +2950,33 @@
           <w:szCs w:val="18"/>
         </w:rPr>
         <w:t xml:space="preserve">  [R4 — Docs]</w:t>
+      </w:r>
+    </w:p>
+    <w:p>
+      <w:pPr>
+        <w:pStyle w:val="ListParagraph"/>
+        <w:numPr>
+          <w:ilvl w:val="0"/>
+          <w:numId w:val="3"/>
+        </w:numPr>
+        <w:spacing w:after="90" w:line="268" w:lineRule="auto"/>
+      </w:pPr>
+      <w:r>
+        <w:rPr>
+          <w:sz w:val="21"/>
+          <w:szCs w:val="21"/>
+        </w:rPr>
+        <w:t xml:space="preserve">The same respondent named scenarios as both the most valuable aspect of the tool and the most confusing, and twice said they needed more practice — pointing to scenario-builder onboarding/worked examples rather than redesign.</w:t>
+      </w:r>
+      <w:r>
+        <w:rPr>
+          <w:b/>
+          <w:bCs/>
+          <w:color w:val="2E5395"/>
+          <w:sz w:val="18"/>
+          <w:szCs w:val="18"/>
+        </w:rPr>
+        <w:t xml:space="preserve">  [R7 — UI/Docs]</w:t>
       </w:r>
     </w:p>
     <w:p>
@@ -3391,6 +3760,123 @@
           <w:szCs w:val="21"/>
         </w:rPr>
         <w:t>Feasibility/critical note (not verified against the model): attributing a joint change to individual interventions is not unique when their effects interact — the answer depends on the decomposition method (e.g. leave-one-out vs sequential/Shapley-style averaging) and can be order-dependent, and components need not sum to the total. The chosen method and its assumptions would need to be defined and shown to users; this is an analytical-design decision, not only a reporting one. Feasibility should be checked against Mock-Up_logic_V2.R before scoping.</w:t>
+      </w:r>
+    </w:p>
+    <w:p>
+      <w:pPr>
+        <w:pStyle w:val="Heading1"/>
+        <w:spacing w:before="320" w:after="140"/>
+      </w:pPr>
+      <w:r>
+        <w:t xml:space="preserve">16. Community-led delivery, structural enablers &amp; investment estimation</w:t>
+      </w:r>
+    </w:p>
+    <w:p>
+      <w:pPr>
+        <w:spacing w:after="140" w:line="276" w:lineRule="auto"/>
+      </w:pPr>
+      <w:r>
+        <w:rPr>
+          <w:sz w:val="21"/>
+          <w:szCs w:val="21"/>
+        </w:rPr>
+        <w:t xml:space="preserve">A theme raised only by the two advocacy-focused NGO respondents added in this round (R6, R7) and not covered by any existing section. The tool currently models biomedical service delivery; it does not represent who delivers that service, nor the structural conditions that determine whether people can take it up.</w:t>
+      </w:r>
+    </w:p>
+    <w:p>
+      <w:pPr>
+        <w:pStyle w:val="ListParagraph"/>
+        <w:numPr>
+          <w:ilvl w:val="0"/>
+          <w:numId w:val="3"/>
+        </w:numPr>
+        <w:spacing w:after="90" w:line="268" w:lineRule="auto"/>
+      </w:pPr>
+      <w:r>
+        <w:rPr>
+          <w:sz w:val="21"/>
+          <w:szCs w:val="21"/>
+        </w:rPr>
+        <w:t xml:space="preserve">Add community-led HIV prevention service-delivery interventions: drop-in centres, outreach, referrals, and prevention literacy / risk communication for behaviour change.</w:t>
+      </w:r>
+      <w:r>
+        <w:rPr>
+          <w:b/>
+          <w:bCs/>
+          <w:color w:val="2E5395"/>
+          <w:sz w:val="18"/>
+          <w:szCs w:val="18"/>
+        </w:rPr>
+        <w:t xml:space="preserve">  [R6 — Logic + UI]</w:t>
+      </w:r>
+    </w:p>
+    <w:p>
+      <w:pPr>
+        <w:pStyle w:val="ListParagraph"/>
+        <w:numPr>
+          <w:ilvl w:val="0"/>
+          <w:numId w:val="3"/>
+        </w:numPr>
+        <w:spacing w:after="90" w:line="268" w:lineRule="auto"/>
+      </w:pPr>
+      <w:r>
+        <w:rPr>
+          <w:sz w:val="21"/>
+          <w:szCs w:val="21"/>
+        </w:rPr>
+        <w:t xml:space="preserve">Enable estimation of the community investment needed to reach targets. R6 frames this as a transition-period necessity: governments are asking CSOs and communities to demonstrate they are integral to the response, and prevention in particular depends on community-health facility linkages.</w:t>
+      </w:r>
+      <w:r>
+        <w:rPr>
+          <w:b/>
+          <w:bCs/>
+          <w:color w:val="2E5395"/>
+          <w:sz w:val="18"/>
+          <w:szCs w:val="18"/>
+        </w:rPr>
+        <w:t xml:space="preserve">  [R6 — Logic]</w:t>
+      </w:r>
+    </w:p>
+    <w:p>
+      <w:pPr>
+        <w:pStyle w:val="ListParagraph"/>
+        <w:numPr>
+          <w:ilvl w:val="0"/>
+          <w:numId w:val="3"/>
+        </w:numPr>
+        <w:spacing w:after="90" w:line="268" w:lineRule="auto"/>
+      </w:pPr>
+      <w:r>
+        <w:rPr>
+          <w:sz w:val="21"/>
+          <w:szCs w:val="21"/>
+        </w:rPr>
+        <w:t xml:space="preserve">Add human rights and structural barriers as modelled, or at minimum documented, factors.</w:t>
+      </w:r>
+      <w:r>
+        <w:rPr>
+          <w:b/>
+          <w:bCs/>
+          <w:color w:val="2E5395"/>
+          <w:sz w:val="18"/>
+          <w:szCs w:val="18"/>
+        </w:rPr>
+        <w:t xml:space="preserve">  [R7 — Logic + UI]</w:t>
+      </w:r>
+    </w:p>
+    <w:p>
+      <w:pPr>
+        <w:spacing w:after="180" w:line="276" w:lineRule="auto"/>
+      </w:pPr>
+      <w:r>
+        <w:rPr>
+          <w:i/>
+          <w:iCs/>
+          <w:color w:val="555555"/>
+          <w:sz w:val="21"/>
+          <w:szCs w:val="21"/>
+        </w:rPr>
+        <w:t xml:space="preserve">Scope note (not verified against the model): these two asks are not equally tractable and should not be scoped as one item. Community-led delivery could plausibly enter as a delivery-channel attribute on existing prevention interventions — affecting unit cost, reach and possibly yield — without requiring new epidemiological pathways. Human rights and structural barriers are harder: they act on uptake and retention rather than being interventions with a coverage level and a unit cost, and any parameterisation would be largely assumption-driven, which cuts against the “no unsourced numbers” principle applied elsewhere in this tool. If either is judged out of scope, that is worth stating explicitly in the documentation: R6 cites this gap as the specific reason their expectations were only partly met, so silence on it will keep resurfacing.</w:t>
       </w:r>
     </w:p>
     <w:p>

</xml_diff>